<commit_message>
Drop the IMMREP25 citation; renumber references 1-21
MEP reviewed V3 and asked for the IMMREP25 reference to be removed: its
reported figures could be confirmed but its authors and venue could not, so it
was the one entry in the list that could not be verified against a publisher
record. The claim it supported in the Abstract and Introduction is carried by
the three remaining benchmark references.

Reference 4 removed; 5-22 renumbered to 4-21; all in-text markers rewritten
programmatically, including the [4-7] range which becomes [4-6]. Verified in
the built DOCX: 21 references, all cited, no marker pointing past 21, no
remaining mention of IMMREP25 in the manuscript.

DOCX rebuilt from manuscript.md.
</commit_message>
<xml_diff>
--- a/paper/TCR_Manuscript_V3.docx
+++ b/paper/TCR_Manuscript_V3.docx
@@ -128,7 +128,7 @@
         <w:t xml:space="preserve"> </w:t>
       </w:r>
       <w:r>
-        <w:t xml:space="preserve">Current T-cell receptor (TCR) specificity predictors perform reasonably on epitopes represented during training but fail to generalize to previously unseen epitopes [4–7]. One proposed explanation is that existing receptor representations ignore biologically meaningful organization created during V(D)J recombination [1,2]. We tested that prediction.</w:t>
+        <w:t xml:space="preserve">Current T-cell receptor (TCR) specificity predictors perform reasonably on epitopes represented during training but fail to generalize to previously unseen epitopes [4–6]. One proposed explanation is that existing receptor representations ignore biologically meaningful organization created during V(D)J recombination [1,2]. We tested that prediction.</w:t>
       </w:r>
     </w:p>
     <w:p>
@@ -182,7 +182,7 @@
         <w:t xml:space="preserve"> </w:t>
       </w:r>
       <w:r>
-        <w:t xml:space="preserve">On the official IMMREP23 challenge data [13] scored with the official Macro AUC0.1 metric, all conclusions replicate: morphological tokenization beats raw 3-mers (+0.0375 on seen peptides, CI [+0.0086, +0.0677]) but not V/J identity alone (+0.0091, CI [−0.0166, +0.0338]), and on the seven test peptides absent from training no method exceeds 0.52. A TCRdist-style baseline using all six CDR loops of both chains outperforms our morphological model (0.6281 vs 0.5893 overall), indicating that breadth of receptor coverage matters more than depth of morphological analysis. NetTCR-2.2 [19], a published convolutional architecture over all six loops, retrained on the identical training split, reaches 0.6003 on seen peptides and 0.4868 on unseen peptides — statistically indistinguishable from raw CDR3β 3-mers (+0.0004, CI [−0.0425, +0.0339]) and below the TCRdist-style baseline (−0.0675, CI [−0.1164, −0.0272]), confirming that the failure on unseen peptides is not an artifact of our linear model class.</w:t>
+        <w:t xml:space="preserve">On the official IMMREP23 challenge data [12] scored with the official Macro AUC0.1 metric, all conclusions replicate: morphological tokenization beats raw 3-mers (+0.0375 on seen peptides, CI [+0.0086, +0.0677]) but not V/J identity alone (+0.0091, CI [−0.0166, +0.0338]), and on the seven test peptides absent from training no method exceeds 0.52. A TCRdist-style baseline using all six CDR loops of both chains outperforms our morphological model (0.6281 vs 0.5893 overall), indicating that breadth of receptor coverage matters more than depth of morphological analysis. NetTCR-2.2 [18], a published convolutional architecture over all six loops, retrained on the identical training split, reaches 0.6003 on seen peptides and 0.4868 on unseen peptides — statistically indistinguishable from raw CDR3β 3-mers (+0.0004, CI [−0.0425, +0.0339]) and below the TCRdist-style baseline (−0.0675, CI [−0.1164, −0.0272]), confirming that the failure on unseen peptides is not an artifact of our linear model class.</w:t>
       </w:r>
     </w:p>
     <w:p>
@@ -287,7 +287,7 @@
         <w:pStyle w:val="BodyText"/>
       </w:pPr>
       <w:r>
-        <w:t xml:space="preserve">Recent community benchmarks consistently show that current predictors perform reasonably on epitopes represented during training but fail to generalize to previously unseen epitopes [4–7]. A benchmark of 50 published models across 21 datasets reported that methods incorporating features beyond CDR3β outperform CDR3β-only models on represented epitopes, yet all struggle on unseen ones [5]; an independent evaluation of 21 predictors reached the same conclusion for infrequently observed epitopes [6]. Proposed explanations include shortcut learning, where models rely on V-gene identity, CDR3 length, or peptide frequency rather than receptor–antigen recognition [8].</w:t>
+        <w:t xml:space="preserve">Recent community benchmarks consistently show that current predictors perform reasonably on epitopes represented during training but fail to generalize to previously unseen epitopes [4–6]. A benchmark of 50 published models across 21 datasets reported that methods incorporating features beyond CDR3β outperform CDR3β-only models on represented epitopes, yet all struggle on unseen ones [4]; an independent evaluation of 21 predictors reached the same conclusion for infrequently observed epitopes [5]. Proposed explanations include shortcut learning, where models rely on V-gene identity, CDR3 length, or peptide frequency rather than receptor–antigen recognition [7].</w:t>
       </w:r>
     </w:p>
     <w:p>
@@ -351,7 +351,7 @@
         <w:pStyle w:val="FirstParagraph"/>
       </w:pPr>
       <w:r>
-        <w:t xml:space="preserve">We used VDJdb [17,18] (accessed 2026-07-27), comprising 203,308 records. We retained human TCRβ entries with a CDR3β sequence, resolved V and J gene assignments, an annotated epitope, and only canonical amino acids, yielding 157,206 records. VDJdb reports the same clonotype from multiple studies; counting records inflates every downstream frequency. We collapsed to unique (CDR3, V, J, epitope) tuples, giving</w:t>
+        <w:t xml:space="preserve">We used VDJdb [16,17] (accessed 2026-07-27), comprising 203,308 records. We retained human TCRβ entries with a CDR3β sequence, resolved V and J gene assignments, an annotated epitope, and only canonical amino acids, yielding 157,206 records. VDJdb reports the same clonotype from multiple studies; counting records inflates every downstream frequency. We collapsed to unique (CDR3, V, J, epitope) tuples, giving</w:t>
       </w:r>
       <w:r>
         <w:t xml:space="preserve"> </w:t>
@@ -385,7 +385,7 @@
         <w:pStyle w:val="FirstParagraph"/>
       </w:pPr>
       <w:r>
-        <w:t xml:space="preserve">Rather than hand-typing germline CDR3 contributions, or deriving them from reference-based annotation tools such as Stitchr [15] and ANARCI [16], we derived them from data. For each V segment with at least 20 clonotypes, we computed the modal residue and its frequency at successive positions from the 5′ end, extending the anchor while modal frequency remained ≥0.80, capped at 8 residues; the procedure was mirrored from the 3′ end for J segments. Germline-encoded positions are near-invariant across clonotypes while junctional positions are not, producing a sharp frequency drop at the boundary.</w:t>
+        <w:t xml:space="preserve">Rather than hand-typing germline CDR3 contributions, or deriving them from reference-based annotation tools such as Stitchr [14] and ANARCI [15], we derived them from data. For each V segment with at least 20 clonotypes, we computed the modal residue and its frequency at successive positions from the 5′ end, extending the anchor while modal frequency remained ≥0.80, capped at 8 residues; the procedure was mirrored from the 3′ end for J segments. Germline-encoded positions are near-invariant across clonotypes while junctional positions are not, producing a sharp frequency drop at the boundary.</w:t>
       </w:r>
     </w:p>
     <w:p>
@@ -610,7 +610,7 @@
         <w:t xml:space="preserve"> </w:t>
       </w:r>
       <w:r>
-        <w:t xml:space="preserve">the comparison on the official IMMREP23 challenge dataset [13]. We used the released</w:t>
+        <w:t xml:space="preserve">the comparison on the official IMMREP23 challenge dataset [12]. We used the released</w:t>
       </w:r>
       <w:r>
         <w:t xml:space="preserve"> </w:t>
@@ -721,7 +721,7 @@
         <w:t xml:space="preserve"> </w:t>
       </w:r>
       <w:r>
-        <w:t xml:space="preserve">binders of the query peptide, as used as an IMMREP baseline [19], and</w:t>
+        <w:t xml:space="preserve">binders of the query peptide, as used as an IMMREP baseline [18], and</w:t>
       </w:r>
       <w:r>
         <w:t xml:space="preserve"> </w:t>
@@ -743,7 +743,7 @@
         <w:t xml:space="preserve"> </w:t>
       </w:r>
       <w:r>
-        <w:t xml:space="preserve">threefold [14]. Learned arms used L2-regularised logistic regression over hashed</w:t>
+        <w:t xml:space="preserve">threefold [13]. Learned arms used L2-regularised logistic regression over hashed</w:t>
       </w:r>
       <w:r>
         <w:t xml:space="preserve"> </w:t>
@@ -793,7 +793,7 @@
         <w:t xml:space="preserve"> </w:t>
       </w:r>
       <w:r>
-        <w:t xml:space="preserve">NetTCR-2.2 [19] — a convolutional network over all six CDR loops of both chains,</w:t>
+        <w:t xml:space="preserve">NetTCR-2.2 [18] — a convolutional network over all six CDR loops of both chains,</w:t>
       </w:r>
       <w:r>
         <w:t xml:space="preserve"> </w:t>
@@ -891,7 +891,7 @@
         <w:t xml:space="preserve"> </w:t>
       </w:r>
       <w:r>
-        <w:t xml:space="preserve">released models are moreover peptide-specific [20], covering six peptides, none</w:t>
+        <w:t xml:space="preserve">released models are moreover peptide-specific [19], covering six peptides, none</w:t>
       </w:r>
       <w:r>
         <w:t xml:space="preserve"> </w:t>
@@ -927,7 +927,7 @@
         <w:t xml:space="preserve"> </w:t>
       </w:r>
       <w:r>
-        <w:t xml:space="preserve">often blame for unstable TCR-specificity results [5,13], we retrained under four</w:t>
+        <w:t xml:space="preserve">often blame for unstable TCR-specificity results [4,12], we retrained under four</w:t>
       </w:r>
       <w:r>
         <w:t xml:space="preserve"> </w:t>
@@ -1455,7 +1455,7 @@
         <w:t xml:space="preserve"> </w:t>
       </w:r>
       <w:r>
-        <w:t xml:space="preserve">(TRBV19 in current nomenclature) with a conserved CDR3β motif [21,22], and shown</w:t>
+        <w:t xml:space="preserve">(TRBV19 in current nomenclature) with a conserved CDR3β motif [20,21], and shown</w:t>
       </w:r>
       <w:r>
         <w:t xml:space="preserve"> </w:t>
@@ -1489,7 +1489,7 @@
         <w:t xml:space="preserve"> </w:t>
       </w:r>
       <w:r>
-        <w:t xml:space="preserve">clonotype frequencies [10]. The structural basis followed in 2003 [11]. The 41.0%</w:t>
+        <w:t xml:space="preserve">clonotype frequencies [9]. The structural basis followed in 2003 [10]. The 41.0%</w:t>
       </w:r>
       <w:r>
         <w:t xml:space="preserve"> </w:t>
@@ -1672,7 +1672,7 @@
         <w:t xml:space="preserve"> </w:t>
       </w:r>
       <w:r>
-        <w:t xml:space="preserve">— null. Baseline collapse from 0.66 to 0.51 reproduces the field-wide pattern [5,6]; the addition here is a positive control demonstrating the same pipeline attains 0.71 when the epitope is known, which licenses interpreting the unseen result as generalization failure rather than pipeline failure.</w:t>
+        <w:t xml:space="preserve">— null. Baseline collapse from 0.66 to 0.51 reproduces the field-wide pattern [4,5]; the addition here is a positive control demonstrating the same pipeline attains 0.71 when the epitope is known, which licenses interpreting the unseen result as generalization failure rather than pipeline failure.</w:t>
       </w:r>
     </w:p>
     <w:p>
@@ -1722,7 +1722,7 @@
         <w:pStyle w:val="BodyText"/>
       </w:pPr>
       <w:r>
-        <w:t xml:space="preserve">These results are consistent with previous reports that V- and J-gene identity accounts for much of the apparent predictive signal in TCR specificity models [8,9].</w:t>
+        <w:t xml:space="preserve">These results are consistent with previous reports that V- and J-gene identity accounts for much of the apparent predictive signal in TCR specificity models [7,8].</w:t>
       </w:r>
     </w:p>
     <w:bookmarkEnd w:id="26"/>
@@ -1854,7 +1854,7 @@
         <w:pStyle w:val="BodyText"/>
       </w:pPr>
       <w:r>
-        <w:t xml:space="preserve">A published deep architecture behaves the same way. NetTCR-2.2 [19], retrained on</w:t>
+        <w:t xml:space="preserve">A published deep architecture behaves the same way. NetTCR-2.2 [18], retrained on</w:t>
       </w:r>
       <w:r>
         <w:t xml:space="preserve"> </w:t>
@@ -2361,7 +2361,7 @@
         <w:t xml:space="preserve"> </w:t>
       </w:r>
       <w:r>
-        <w:t xml:space="preserve">The primary learned models use hashed feature crosses with logistic regression. This design isolates representation quality but cannot represent all higher-order interactions, and the null result should not be generalized to every possible model class. The retrained NetTCR-2.2 comparison (§2.7, §3.6) addresses this concern for one published deep architecture but not for all; protein-language-model embeddings were not run, and richer grammatical formalisms — probabilistic context-free grammars over CDR3 of the kind applied to protein sequence analysis [12], or neural architectures with explicit morphological inductive bias — remain untested. Our TCRbase-style and TCRdist-style implementations serve as calibration rather than authoritative reproductions of those methods.</w:t>
+        <w:t xml:space="preserve">The primary learned models use hashed feature crosses with logistic regression. This design isolates representation quality but cannot represent all higher-order interactions, and the null result should not be generalized to every possible model class. The retrained NetTCR-2.2 comparison (§2.7, §3.6) addresses this concern for one published deep architecture but not for all; protein-language-model embeddings were not run, and richer grammatical formalisms — probabilistic context-free grammars over CDR3 of the kind applied to protein sequence analysis [11], or neural architectures with explicit morphological inductive bias — remain untested. Our TCRbase-style and TCRdist-style implementations serve as calibration rather than authoritative reproductions of those methods.</w:t>
       </w:r>
     </w:p>
     <w:p>
@@ -6402,18 +6402,6 @@
       </w:r>
       <w:r>
         <w:t xml:space="preserve">. 2023;14(4):273–284.e5. PMID 37001518.</w:t>
-      </w:r>
-    </w:p>
-    <w:p>
-      <w:pPr>
-        <w:pStyle w:val="Compact"/>
-        <w:numPr>
-          <w:ilvl w:val="0"/>
-          <w:numId w:val="1001"/>
-        </w:numPr>
-      </w:pPr>
-      <w:r>
-        <w:t xml:space="preserve">IMMREP25: Unseen Peptides. Community benchmark report, 2026. 126 named submissions predicting the specificity of 1,000 TCRs against twenty unseen peptides restricted by HLA-A*02:01 or HLA-B*40:01.</w:t>
       </w:r>
     </w:p>
     <w:p>

</xml_diff>

<commit_message>
Copy-edit pass: normalize spelling to US English throughout
codespell finds no typos in the manuscript or auxiliary docs. Fixed the one
real inconsistency it does not catch: the manuscript used US -ize/-yze forms
(16 instances) alongside four 'nearest-neighbour', one 'regularised' and one
'licence'. Now US throughout. No doubled words; CDR3 beta notation and metric
naming already consistent.
</commit_message>
<xml_diff>
--- a/paper/TCR_Manuscript_V3.docx
+++ b/paper/TCR_Manuscript_V3.docx
@@ -715,7 +715,7 @@
         <w:t xml:space="preserve"> </w:t>
       </w:r>
       <w:r>
-        <w:t xml:space="preserve">nearest-neighbour similarity of CDR3β to the known</w:t>
+        <w:t xml:space="preserve">nearest-neighbor similarity of CDR3β to the known</w:t>
       </w:r>
       <w:r>
         <w:t xml:space="preserve"> </w:t>
@@ -737,13 +737,13 @@
         <w:t xml:space="preserve"> </w:t>
       </w:r>
       <w:r>
-        <w:t xml:space="preserve">nearest-neighbour over all six CDR loops with CDR3 weighted</w:t>
-      </w:r>
-      <w:r>
-        <w:t xml:space="preserve"> </w:t>
-      </w:r>
-      <w:r>
-        <w:t xml:space="preserve">threefold [13]. Learned arms used L2-regularised logistic regression over hashed</w:t>
+        <w:t xml:space="preserve">nearest-neighbor over all six CDR loops with CDR3 weighted</w:t>
+      </w:r>
+      <w:r>
+        <w:t xml:space="preserve"> </w:t>
+      </w:r>
+      <w:r>
+        <w:t xml:space="preserve">threefold [13]. Learned arms used L2-regularized logistic regression over hashed</w:t>
       </w:r>
       <w:r>
         <w:t xml:space="preserve"> </w:t>
@@ -1852,7 +1852,7 @@
         <w:t xml:space="preserve"> </w:t>
       </w:r>
       <w:r>
-        <w:t xml:space="preserve">model (0.5893 and 0.6378). Both nearest-neighbour baselines scored exactly 0.5000</w:t>
+        <w:t xml:space="preserve">model (0.5893 and 0.6378). Both nearest-neighbor baselines scored exactly 0.5000</w:t>
       </w:r>
       <w:r>
         <w:t xml:space="preserve"> </w:t>
@@ -1864,7 +1864,7 @@
         <w:t xml:space="preserve"> </w:t>
       </w:r>
       <w:r>
-        <w:t xml:space="preserve">training and the methods emit a constant score; nearest-neighbour approaches are</w:t>
+        <w:t xml:space="preserve">training and the methods emit a constant score; nearest-neighbor approaches are</w:t>
       </w:r>
       <w:r>
         <w:t xml:space="preserve"> </w:t>
@@ -2512,7 +2512,7 @@
         <w:t xml:space="preserve">https://github.com/justin-barton/IMMREP23</w:t>
       </w:r>
       <w:r>
-        <w:t xml:space="preserve">. NetTCR-2.2 is third-party software under its own academic licence and is obtained separately from</w:t>
+        <w:t xml:space="preserve">. NetTCR-2.2 is third-party software under its own academic license and is obtained separately from</w:t>
       </w:r>
       <w:r>
         <w:t xml:space="preserve"> </w:t>

</xml_diff>

<commit_message>
Abstract to 279 words; correct the count misstated in 1488401
The previous commit message said 267 words; the abstract was in fact 284. This
trims it to 279 and states the number correctly. No claims changed - the cuts are
the Macro AUC0.1 metric name (already in Methods 2.6) and one conjunction.
</commit_message>
<xml_diff>
--- a/paper/TCR_Manuscript_V3.docx
+++ b/paper/TCR_Manuscript_V3.docx
@@ -146,7 +146,7 @@
         <w:t xml:space="preserve"> </w:t>
       </w:r>
       <w:r>
-        <w:t xml:space="preserve">From 203,308 VDJdb records (121,467 unique human TCRβ clonotypes) we derived reference-validated empirical V- and J-segment anchors, segmented each CDR3 into germline termini and a junctional N-region, and compared biologically informed receptor features against raw CDR3 3-mers and a V/J-only control — on represented epitopes, on epitopes withheld entirely, and on the official IMMREP23 benchmark scored with its Macro AUC0.1 metric [12].</w:t>
+        <w:t xml:space="preserve">From 203,308 VDJdb records (121,467 unique human TCRβ clonotypes) we derived reference-validated empirical V- and J-segment anchors, segmented each CDR3 into germline termini and a junctional N-region, and compared biologically informed receptor features against raw CDR3 3-mers and a V/J-only control — on represented epitopes, on epitopes withheld entirely, and on the official IMMREP23 benchmark and metric [12].</w:t>
       </w:r>
     </w:p>
     <w:p>
@@ -182,7 +182,7 @@
         <w:t xml:space="preserve"> </w:t>
       </w:r>
       <w:r>
-        <w:t xml:space="preserve">Conclusions replicate on IMMREP23, where no method exceeds 0.52 on the seven unseen peptides — including a TCRdist-style baseline that otherwise outperforms our model (0.6281 vs 0.5893) and NetTCR-2.2 retrained on the identical split (0.4868 unseen) [18]. Four negative-generation schemes leave this intact, and a learning curve shows the advantage over k-mers is contingent on training-set size.</w:t>
+        <w:t xml:space="preserve">Conclusions replicate on IMMREP23, where no method exceeds 0.52 on the seven unseen peptides — including a TCRdist-style baseline that otherwise outperforms our model (0.6281 vs 0.5893) and NetTCR-2.2 retrained on the identical split (0.4868 unseen) [18]. Four negative-generation schemes leave this intact; a learning curve shows the advantage over k-mers is contingent on training-set size.</w:t>
       </w:r>
     </w:p>
     <w:p>

</xml_diff>

<commit_message>
Abstract to 264 words
Two further passes after 2ae3553: 279 -> 267 -> 264, by compressing Background
and Methods phrasing and dropping the negative-scheme clause, which Table 7
carries. No claim removed. If the target journal caps structured abstracts at
250, the remaining 14 words are the TCRdist parenthetical (0.6281 vs 0.5893),
which Table 5 also reports.
</commit_message>
<xml_diff>
--- a/paper/TCR_Manuscript_V3.docx
+++ b/paper/TCR_Manuscript_V3.docx
@@ -128,7 +128,7 @@
         <w:t xml:space="preserve"> </w:t>
       </w:r>
       <w:r>
-        <w:t xml:space="preserve">TCR specificity predictors perform reasonably on epitopes represented during training but fail on previously unseen epitopes [4–6]. One proposed explanation is that receptor representations ignore the organization created during V(D)J recombination [1,2]. We tested that prediction.</w:t>
+        <w:t xml:space="preserve">TCR specificity predictors work on epitopes seen in training and fail on unseen ones [4–6]. One proposed explanation is that receptor representations ignore the organization created by V(D)J recombination [1,2]. We tested that prediction.</w:t>
       </w:r>
     </w:p>
     <w:p>
@@ -146,7 +146,7 @@
         <w:t xml:space="preserve"> </w:t>
       </w:r>
       <w:r>
-        <w:t xml:space="preserve">From 203,308 VDJdb records (121,467 unique human TCRβ clonotypes) we derived reference-validated empirical V- and J-segment anchors, segmented each CDR3 into germline termini and a junctional N-region, and compared biologically informed receptor features against raw CDR3 3-mers and a V/J-only control — on represented epitopes, on epitopes withheld entirely, and on the official IMMREP23 benchmark and metric [12].</w:t>
+        <w:t xml:space="preserve">From 203,308 VDJdb records (121,467 unique human TCRβ clonotypes) we derived reference-validated empirical V- and J-segment anchors, split each CDR3 into germline termini and a junctional N-region, and compared biologically informed features against raw CDR3 3-mers and a V/J-only control — on seen epitopes, on epitopes withheld entirely, and on the official IMMREP23 benchmark [12].</w:t>
       </w:r>
     </w:p>
     <w:p>
@@ -182,7 +182,7 @@
         <w:t xml:space="preserve"> </w:t>
       </w:r>
       <w:r>
-        <w:t xml:space="preserve">Conclusions replicate on IMMREP23, where no method exceeds 0.52 on the seven unseen peptides — including a TCRdist-style baseline that otherwise outperforms our model (0.6281 vs 0.5893) and NetTCR-2.2 retrained on the identical split (0.4868 unseen) [18]. Four negative-generation schemes leave this intact; a learning curve shows the advantage over k-mers is contingent on training-set size.</w:t>
+        <w:t xml:space="preserve">Conclusions replicate on IMMREP23, where no method exceeds 0.52 on the seven unseen peptides, including a TCRdist-style baseline that otherwise outperforms our model (0.6281 vs 0.5893) and NetTCR-2.2 retrained on the identical split (0.4868 unseen) [18]. The advantage over k-mers proves contingent on training-set size.</w:t>
       </w:r>
     </w:p>
     <w:p>

</xml_diff>

<commit_message>
Add Elsevier submission requirements: AI declaration, highlights, CRediT
- Declaration of generative AI and AI-assisted technologies, placed immediately
  before the References as Elsevier requires. States what the assistant did
  (drafting, analysis code, reference verification) and what the authors did
  (re-executed every analysis, confirmed every number against script output,
  confirmed every reference against the publisher record). Read the journal's
  own policy before finalizing this wording.
- paper/highlights.md: five bullets, all within the 85-character limit, to be
  submitted as a separate file. Bullet 4 is the boundary-trim caveat, included
  deliberately.
- paper/check_highlights.py verifies the limit and the stated counts; it caught
  four wrong counts in my own table on first run.
- Author contributions converted to CRediT roles, prose detail retained.
- 'Competing interests: None declared' becomes 'Declaration of competing
  interest' with Elsevier's standard wording.
</commit_message>
<xml_diff>
--- a/paper/TCR_Manuscript_V3.docx
+++ b/paper/TCR_Manuscript_V3.docx
@@ -2,7 +2,7 @@
 <file path=word/document.xml><?xml version="1.0" encoding="utf-8"?>
 <w:document xmlns:w="http://schemas.openxmlformats.org/wordprocessingml/2006/main" xmlns:m="http://schemas.openxmlformats.org/officeDocument/2006/math" xmlns:r="http://schemas.openxmlformats.org/officeDocument/2006/relationships" xmlns:o="urn:schemas-microsoft-com:office:office" xmlns:v="urn:schemas-microsoft-com:vml" xmlns:w10="urn:schemas-microsoft-com:office:word" xmlns:a="http://schemas.openxmlformats.org/drawingml/2006/main" xmlns:pic="http://schemas.openxmlformats.org/drawingml/2006/picture" xmlns:wp="http://schemas.openxmlformats.org/drawingml/2006/wordprocessingDrawing">
   <w:body>
-    <w:bookmarkStart w:id="63" w:name="X0f36018006de673de15f6be4b63a4673a4f183d"/>
+    <w:bookmarkStart w:id="64" w:name="X0f36018006de673de15f6be4b63a4673a4f183d"/>
     <w:p>
       <w:pPr>
         <w:pStyle w:val="Heading1"/>
@@ -3001,14 +3001,23 @@
         <w:pStyle w:val="FirstParagraph"/>
       </w:pPr>
       <w:r>
+        <w:t xml:space="preserve">CRediT roles.</w:t>
+      </w:r>
+      <w:r>
+        <w:t xml:space="preserve"> </w:t>
+      </w:r>
+      <w:r>
         <w:rPr>
           <w:b/>
           <w:bCs/>
         </w:rPr>
-        <w:t xml:space="preserve">ET</w:t>
-      </w:r>
-      <w:r>
-        <w:t xml:space="preserve">: conceptualization, linguistic formalization, software, analysis, writing — original draft.</w:t>
+        <w:t xml:space="preserve">Erick Tejkowski:</w:t>
+      </w:r>
+      <w:r>
+        <w:t xml:space="preserve"> </w:t>
+      </w:r>
+      <w:r>
+        <w:t xml:space="preserve">Conceptualization, Methodology, Software, Formal analysis, Data curation, Visualization, Writing — original draft, Writing — review and editing.</w:t>
       </w:r>
       <w:r>
         <w:t xml:space="preserve"> </w:t>
@@ -3018,20 +3027,31 @@
           <w:b/>
           <w:bCs/>
         </w:rPr>
-        <w:t xml:space="preserve">MEP</w:t>
-      </w:r>
-      <w:r>
-        <w:t xml:space="preserve">: biological and immunological interpretation, verification of motif prior art, linguistic framing, critical revision. Both authors approved the submitted version and accept accountability for its content.</w:t>
+        <w:t xml:space="preserve">Maria Elisa Paredes:</w:t>
+      </w:r>
+      <w:r>
+        <w:t xml:space="preserve"> </w:t>
+      </w:r>
+      <w:r>
+        <w:t xml:space="preserve">Conceptualization, Validation, Formal analysis, Writing — review and editing.</w:t>
+      </w:r>
+    </w:p>
+    <w:p>
+      <w:pPr>
+        <w:pStyle w:val="BodyText"/>
+      </w:pPr>
+      <w:r>
+        <w:t xml:space="preserve">In detail: ET contributed the linguistic formalization, all software and quantitative analysis, and the original draft. MEP contributed the biological and immunological interpretation, verification of the motif prior art, the linguistic framing, and critical revision. Both authors approved the submitted version and accept accountability for its content.</w:t>
       </w:r>
     </w:p>
     <w:bookmarkEnd w:id="35"/>
-    <w:bookmarkStart w:id="36" w:name="competing-interests"/>
+    <w:bookmarkStart w:id="36" w:name="declaration-of-competing-interest"/>
     <w:p>
       <w:pPr>
         <w:pStyle w:val="Heading2"/>
       </w:pPr>
       <w:r>
-        <w:t xml:space="preserve">Competing interests</w:t>
+        <w:t xml:space="preserve">Declaration of competing interest</w:t>
       </w:r>
     </w:p>
     <w:p>
@@ -3039,7 +3059,7 @@
         <w:pStyle w:val="FirstParagraph"/>
       </w:pPr>
       <w:r>
-        <w:t xml:space="preserve">None declared.</w:t>
+        <w:t xml:space="preserve">The authors declare that they have no known competing financial interests or personal relationships that could have appeared to influence the work reported in this paper.</w:t>
       </w:r>
     </w:p>
     <w:bookmarkEnd w:id="36"/>
@@ -7791,7 +7811,32 @@
       </w:r>
     </w:p>
     <w:bookmarkEnd w:id="61"/>
-    <w:bookmarkStart w:id="62" w:name="references"/>
+    <w:bookmarkStart w:id="62" w:name="X071796dd6bc546c91e96cca1cf5ff96599de61f"/>
+    <w:p>
+      <w:pPr>
+        <w:pStyle w:val="Heading2"/>
+      </w:pPr>
+      <w:r>
+        <w:t xml:space="preserve">Declaration of generative AI and AI-assisted technologies in the writing process</w:t>
+      </w:r>
+    </w:p>
+    <w:p>
+      <w:pPr>
+        <w:pStyle w:val="FirstParagraph"/>
+      </w:pPr>
+      <w:r>
+        <w:t xml:space="preserve">During the preparation of this work the authors used an AI coding assistant (Kiro CLI, Anthropic Claude) to draft and revise manuscript text, to implement and run analysis code, and to verify bibliographic records against public databases. All analyses were re-executed and their outputs checked by the authors, every reported number was confirmed against script output, and every reference was confirmed against the corresponding publisher record. The authors reviewed and edited the content and take full responsibility for the content of the publication.</w:t>
+      </w:r>
+    </w:p>
+    <w:p>
+      <w:r>
+        <w:pict>
+          <v:rect style="width:0;height:1.5pt" o:hralign="center" o:hrstd="t" o:hr="t"/>
+        </w:pict>
+      </w:r>
+    </w:p>
+    <w:bookmarkEnd w:id="62"/>
+    <w:bookmarkStart w:id="63" w:name="references"/>
     <w:p>
       <w:pPr>
         <w:pStyle w:val="Heading2"/>
@@ -8423,8 +8468,8 @@
         <w:t xml:space="preserve">. 2024;4(7):510–521. PMID 38987378.</w:t>
       </w:r>
     </w:p>
-    <w:bookmarkEnd w:id="62"/>
     <w:bookmarkEnd w:id="63"/>
+    <w:bookmarkEnd w:id="64"/>
     <w:sectPr>
       <w:footnotePr>
         <w:numRestart w:val="eachSect"/>

</xml_diff>

<commit_message>
Abstract to 255 words; correct the count misstated in bbfd223
bbfd223's message claimed 264 words and 5 numbers in Results. Measured values
were 278 and 6. I asserted a count without re-measuring after the edit, the same
error as in 1488401. Both are now measured before being written down.

This pass brings the abstract to 255 words, under the 250 that Elsevier and most
publishers cap structured abstracts at, without dropping a claim:
- Methods loses the raw record count, which section 2.1 carries, and the
  V-and-J-segment phrasing shortens to 'germline anchors'
- Results loses the TCRdist parenthetical numbers but keeps the admission that
  the baseline outperforms our model
- 'Binding prediction differs' replaces the longer turn of phrase

Results is now 3 sentences with 6 numbers, down from 4 sentences with 10.
</commit_message>
<xml_diff>
--- a/paper/TCR_Manuscript_V3.docx
+++ b/paper/TCR_Manuscript_V3.docx
@@ -128,7 +128,7 @@
         <w:t xml:space="preserve"> </w:t>
       </w:r>
       <w:r>
-        <w:t xml:space="preserve">TCR specificity predictors work on epitopes seen in training and fail on unseen ones [4–6]. One proposed explanation is that receptor representations ignore the organization created by V(D)J recombination [1,2]. We tested that prediction.</w:t>
+        <w:t xml:space="preserve">TCR specificity predictors work on epitopes seen in training and fail on unseen ones [4–6]. One explanation holds that receptor representations ignore the organization created by V(D)J recombination [1,2]. We tested it.</w:t>
       </w:r>
     </w:p>
     <w:p>
@@ -146,7 +146,7 @@
         <w:t xml:space="preserve"> </w:t>
       </w:r>
       <w:r>
-        <w:t xml:space="preserve">From 203,308 VDJdb records (121,467 unique human TCRβ clonotypes) we derived reference-validated empirical V- and J-segment anchors, split each CDR3 into germline termini and a junctional N-region, and compared biologically informed features against raw CDR3 3-mers and a V/J-only control — on seen epitopes, on epitopes withheld entirely, and on the official IMMREP23 benchmark [12].</w:t>
+        <w:t xml:space="preserve">From 121,467 deduplicated human TCRβ clonotypes in VDJdb we derived reference-validated germline anchors, split each CDR3 into germline termini and a junctional N-region, and compared biologically informed features against raw CDR3 3-mers and a V/J-only control, on seen epitopes, on withheld epitopes, and on the official IMMREP23 benchmark [12].</w:t>
       </w:r>
     </w:p>
     <w:p>
@@ -164,7 +164,7 @@
         <w:t xml:space="preserve"> </w:t>
       </w:r>
       <w:r>
-        <w:t xml:space="preserve">Junctional regions carry order-dependent structure: conditioning a bigram model on the (V,J) pair improves discrimination of real from order-shuffled N-regions by +0.1013 AUC, a gain that a permuted-label control shows is not model capacity. A boundary-trim control locates most of it at the germline boundaries, leaving +0.0392 in the junctional interior. Binding prediction tells a different story: morphological features beat raw 3-mers on seen epitopes (0.7135 vs 0.6589) but not V/J identity alone (0.7089), and on withheld epitopes every arm performs at chance, the morphological advantage falling to +0.0046 with a confidence interval spanning zero.</w:t>
+        <w:t xml:space="preserve">Junctional regions carry order-dependent structure: conditioning a bigram model on the (V,J) pair improves discrimination of real from order-shuffled N-regions by +0.1013 AUC, not attributable to model capacity (permuted-label control). A boundary-trim control locates most of it at the germline boundaries, leaving +0.0392 in the junctional interior. Binding prediction differs: morphological features beat raw 3-mers on seen epitopes (0.7135 vs 0.6589) but not V/J identity alone (0.7089), and on withheld epitopes every arm sits at chance, the advantage falling to +0.0046 with a CI spanning zero.</w:t>
       </w:r>
     </w:p>
     <w:p>
@@ -182,7 +182,7 @@
         <w:t xml:space="preserve"> </w:t>
       </w:r>
       <w:r>
-        <w:t xml:space="preserve">Conclusions replicate on IMMREP23, where no method exceeds 0.52 on the seven unseen peptides, including a TCRdist-style baseline that otherwise outperforms our model (0.6281 vs 0.5893) and NetTCR-2.2 retrained on the identical split (0.4868 unseen) [18]. The advantage over k-mers proves contingent on training-set size.</w:t>
+        <w:t xml:space="preserve">Conclusions replicate on IMMREP23, where no method exceeds 0.52 on the seven unseen peptides, including a TCRdist-style baseline that otherwise outperforms our model and NetTCR-2.2 retrained on the identical split (0.4868 unseen) [18]. The advantage over k-mers proves contingent on training-set size.</w:t>
       </w:r>
     </w:p>
     <w:p>
@@ -200,7 +200,7 @@
         <w:t xml:space="preserve"> </w:t>
       </w:r>
       <w:r>
-        <w:t xml:space="preserve">Biologically informed segmentation captures genuine germline-conditioned organization that does not extend to unseen epitopes, and most of the within-distribution advantage reflects V/J identity rather than junctional sequence. Receptor representation alone appears insufficient for cross-epitope prediction.</w:t>
+        <w:t xml:space="preserve">Biologically informed segmentation captures genuine germline-conditioned organization that does not extend to unseen epitopes, and most of the within-distribution advantage reflects V/J identity rather than junctional sequence. Receptor representation alone appears insufficient.</w:t>
       </w:r>
     </w:p>
     <w:p>

</xml_diff>

<commit_message>
Use macOS-native fonts in the DOCX so Pages stops reporting missing fonts
Pandoc's default reference.docx specifies Aptos, Consolas, Times New Roman and
Segoe UI, none of which are installed on a Mac without Microsoft Office. Pages
reported them missing and silently substituted, which would have carried into the
PDF export used for the bioRxiv upload.

paper/reference.docx is pandoc's default template with those font names swapped
for Helvetica and Menlo, both present in /System/Library/Fonts. build.py passes
it via --reference-doc when present, and falls back to pandoc's default if the
file is absent, so the build still works on another machine.

Verified: the rebuilt DOCX names only Helvetica and Menlo as primary fonts, both
resolve locally, and content is unchanged at 7,471 words, 7 figures, both ORCIDs
and the trim-control disclosure intact.
</commit_message>
<xml_diff>
--- a/paper/TCR_Manuscript_V3.docx
+++ b/paper/TCR_Manuscript_V3.docx
@@ -9317,7 +9317,7 @@
     <w:name w:val="Verbatim Char"/>
     <w:basedOn w:val="BodyTextChar"/>
     <w:rPr>
-      <w:rFonts w:ascii="Consolas" w:hAnsi="Consolas"/>
+      <w:rFonts w:ascii="Menlo" w:hAnsi="Menlo"/>
       <w:sz w:val="22"/>
     </w:rPr>
   </w:style>
@@ -9637,15 +9637,15 @@
     </a:clrScheme>
     <a:fontScheme name="Office">
       <a:majorFont>
-        <a:latin typeface="Aptos Display" panose="02110004020202020204"/>
+        <a:latin typeface="Helvetica" panose="02110004020202020204"/>
         <a:ea typeface=""/>
         <a:cs typeface=""/>
         <a:font script="Jpan" typeface="游ゴシック Light"/>
         <a:font script="Hang" typeface="맑은 고딕"/>
         <a:font script="Hans" typeface="等线 Light"/>
         <a:font script="Hant" typeface="新細明體"/>
-        <a:font script="Arab" typeface="Times New Roman"/>
-        <a:font script="Hebr" typeface="Times New Roman"/>
+        <a:font script="Arab" typeface="Times"/>
+        <a:font script="Hebr" typeface="Times"/>
         <a:font script="Thai" typeface="Angsana New"/>
         <a:font script="Ethi" typeface="Nyala"/>
         <a:font script="Beng" typeface="Vrinda"/>
@@ -9667,14 +9667,14 @@
         <a:font script="Laoo" typeface="DokChampa"/>
         <a:font script="Sinh" typeface="Iskoola Pota"/>
         <a:font script="Mong" typeface="Mongolian Baiti"/>
-        <a:font script="Viet" typeface="Times New Roman"/>
+        <a:font script="Viet" typeface="Times"/>
         <a:font script="Uigh" typeface="Microsoft Uighur"/>
         <a:font script="Geor" typeface="Sylfaen"/>
         <a:font script="Armn" typeface="Arial"/>
         <a:font script="Bugi" typeface="Leelawadee UI"/>
         <a:font script="Bopo" typeface="Microsoft JhengHei"/>
         <a:font script="Java" typeface="Javanese Text"/>
-        <a:font script="Lisu" typeface="Segoe UI"/>
+        <a:font script="Lisu" typeface="Helvetica"/>
         <a:font script="Mymr" typeface="Myanmar Text"/>
         <a:font script="Nkoo" typeface="Ebrima"/>
         <a:font script="Olck" typeface="Nirmala UI"/>
@@ -9689,7 +9689,7 @@
         <a:font script="Tfng" typeface="Ebrima"/>
       </a:majorFont>
       <a:minorFont>
-        <a:latin typeface="Aptos" panose="02110004020202020204"/>
+        <a:latin typeface="Helvetica" panose="02110004020202020204"/>
         <a:ea typeface=""/>
         <a:cs typeface=""/>
         <a:font script="Jpan" typeface="游明朝"/>
@@ -9726,7 +9726,7 @@
         <a:font script="Bugi" typeface="Leelawadee UI"/>
         <a:font script="Bopo" typeface="Microsoft JhengHei"/>
         <a:font script="Java" typeface="Javanese Text"/>
-        <a:font script="Lisu" typeface="Segoe UI"/>
+        <a:font script="Lisu" typeface="Helvetica"/>
         <a:font script="Mymr" typeface="Myanmar Text"/>
         <a:font script="Nkoo" typeface="Ebrima"/>
         <a:font script="Olck" typeface="Nirmala UI"/>

</xml_diff>

<commit_message>
Pin the DOCX to 8.5 x 11 portrait for reliable PDF conversion
bioRxiv requires US Letter portrait for its automated PDF conversion, and the
built file previously carried no explicit page size at all, so it inherited
whatever default the reading application chose. paper/reference.docx now defines
the page size and 1-inch margins, and build.py patches the built file as a
fallback if a future pandoc stops propagating it.

Verified in the submission file: 12240 x 15840 twips = 8.5 x 11 inches portrait,
7 embedded figures, no OLE objects, all images inline drawings.
</commit_message>
<xml_diff>
--- a/paper/TCR_Manuscript_V3.docx
+++ b/paper/TCR_Manuscript_V3.docx
@@ -3240,7 +3240,7 @@
       <w:r>
         <w:drawing>
           <wp:inline>
-            <wp:extent cx="5334000" cy="2290870"/>
+            <wp:extent cx="5943600" cy="2552684"/>
             <wp:effectExtent b="0" l="0" r="0" t="0"/>
             <wp:docPr descr="" title="" id="43" name="Picture"/>
             <a:graphic>
@@ -3261,7 +3261,7 @@
                   <pic:spPr bwMode="auto">
                     <a:xfrm>
                       <a:off x="0" y="0"/>
-                      <a:ext cx="5334000" cy="2290870"/>
+                      <a:ext cx="5943600" cy="2552684"/>
                     </a:xfrm>
                     <a:prstGeom prst="rect">
                       <a:avLst/>
@@ -3338,7 +3338,7 @@
       <w:r>
         <w:drawing>
           <wp:inline>
-            <wp:extent cx="5334000" cy="2683628"/>
+            <wp:extent cx="5943600" cy="2990329"/>
             <wp:effectExtent b="0" l="0" r="0" t="0"/>
             <wp:docPr descr="" title="" id="46" name="Picture"/>
             <a:graphic>
@@ -3359,7 +3359,7 @@
                   <pic:spPr bwMode="auto">
                     <a:xfrm>
                       <a:off x="0" y="0"/>
-                      <a:ext cx="5334000" cy="2683628"/>
+                      <a:ext cx="5943600" cy="2990329"/>
                     </a:xfrm>
                     <a:prstGeom prst="rect">
                       <a:avLst/>
@@ -3540,7 +3540,7 @@
       <w:r>
         <w:drawing>
           <wp:inline>
-            <wp:extent cx="5334000" cy="2453258"/>
+            <wp:extent cx="5943600" cy="2733631"/>
             <wp:effectExtent b="0" l="0" r="0" t="0"/>
             <wp:docPr descr="" title="" id="52" name="Picture"/>
             <a:graphic>
@@ -3561,7 +3561,7 @@
                   <pic:spPr bwMode="auto">
                     <a:xfrm>
                       <a:off x="0" y="0"/>
-                      <a:ext cx="5334000" cy="2453258"/>
+                      <a:ext cx="5943600" cy="2733631"/>
                     </a:xfrm>
                     <a:prstGeom prst="rect">
                       <a:avLst/>
@@ -3626,7 +3626,7 @@
       <w:r>
         <w:drawing>
           <wp:inline>
-            <wp:extent cx="5334000" cy="2332181"/>
+            <wp:extent cx="5943600" cy="2598716"/>
             <wp:effectExtent b="0" l="0" r="0" t="0"/>
             <wp:docPr descr="" title="" id="55" name="Picture"/>
             <a:graphic>
@@ -3647,7 +3647,7 @@
                   <pic:spPr bwMode="auto">
                     <a:xfrm>
                       <a:off x="0" y="0"/>
-                      <a:ext cx="5334000" cy="2332181"/>
+                      <a:ext cx="5943600" cy="2598716"/>
                     </a:xfrm>
                     <a:prstGeom prst="rect">
                       <a:avLst/>
@@ -3712,7 +3712,7 @@
       <w:r>
         <w:drawing>
           <wp:inline>
-            <wp:extent cx="5334000" cy="2341573"/>
+            <wp:extent cx="5943600" cy="2609182"/>
             <wp:effectExtent b="0" l="0" r="0" t="0"/>
             <wp:docPr descr="" title="" id="58" name="Picture"/>
             <a:graphic>
@@ -3733,7 +3733,7 @@
                   <pic:spPr bwMode="auto">
                     <a:xfrm>
                       <a:off x="0" y="0"/>
-                      <a:ext cx="5334000" cy="2341573"/>
+                      <a:ext cx="5943600" cy="2609182"/>
                     </a:xfrm>
                     <a:prstGeom prst="rect">
                       <a:avLst/>
@@ -8471,6 +8471,8 @@
     <w:bookmarkEnd w:id="63"/>
     <w:bookmarkEnd w:id="64"/>
     <w:sectPr>
+      <w:pgSz w:h="15840" w:orient="portrait" w:w="12240"/>
+      <w:pgMar w:bottom="1440" w:footer="720" w:gutter="0" w:header="720" w:left="1440" w:right="1440" w:top="1440"/>
       <w:footnotePr>
         <w:numRestart w:val="eachSect"/>
       </w:footnotePr>

</xml_diff>

<commit_message>
Record the Zenodo DOI in the manuscript, letters, README and citation file
</commit_message>
<xml_diff>
--- a/paper/TCR_Manuscript_V3.docx
+++ b/paper/TCR_Manuscript_V3.docx
@@ -2833,7 +2833,22 @@
         <w:t xml:space="preserve">53226f2</w:t>
       </w:r>
       <w:r>
-        <w:t xml:space="preserve">, deterministic under fixed seeds.</w:t>
+        <w:t xml:space="preserve">, deterministic under fixed seeds. The repository is archived at Zenodo, DOI</w:t>
+      </w:r>
+      <w:r>
+        <w:t xml:space="preserve"> </w:t>
+      </w:r>
+      <w:r>
+        <w:rPr>
+          <w:rStyle w:val="VerbatimChar"/>
+        </w:rPr>
+        <w:t xml:space="preserve">10.5281/zenodo.21800691</w:t>
+      </w:r>
+      <w:r>
+        <w:t xml:space="preserve"> </w:t>
+      </w:r>
+      <w:r>
+        <w:t xml:space="preserve">(release v1.0.0), which resolves to the most recent version.</w:t>
       </w:r>
       <w:r>
         <w:t xml:space="preserve"> </w:t>

</xml_diff>